<commit_message>
Update resonance theory drafts
This commit refreshes the WIP draft documents for the resonance-oriented theory set, including ARFT, CRD, DRT, DIF, DEFT, GIE, HCD, HIRP, LRA, NSIT, PPT, RIT, and VFCT. The revisions update the working content across the collection as the conceptual frameworks continue to evolve.
</commit_message>
<xml_diff>
--- a/04_WIP/Drafts/Adaptive Resonance Filtering Theory (ARFT).docx
+++ b/04_WIP/Drafts/Adaptive Resonance Filtering Theory (ARFT).docx
@@ -117,7 +117,7 @@
         </w:rPr>
         <w:t xml:space="preserve"> </w:t>
       </w:r>
-      <w:hyperlink r:id="rId8" w:tgtFrame="_blank" w:history="1">
+      <w:hyperlink r:id="rId11" w:tgtFrame="_blank" w:history="1">
         <w:r>
           <w:rPr>
             <w:rStyle w:val="Hyperlink"/>
@@ -161,7 +161,7 @@
         </w:rPr>
         <w:t xml:space="preserve"> </w:t>
       </w:r>
-      <w:hyperlink r:id="rId9" w:tgtFrame="_blank" w:history="1">
+      <w:hyperlink r:id="rId12" w:tgtFrame="_blank" w:history="1">
         <w:r>
           <w:rPr>
             <w:rStyle w:val="Hyperlink"/>
@@ -205,35 +205,6 @@
           </w14:textOutline>
         </w:rPr>
       </w:pPr>
-      <w:r>
-        <w:rPr>
-          <w:color w:val="000000"/>
-          <w:sz w:val="18"/>
-          <w:szCs w:val="18"/>
-          <w:u w:color="000000"/>
-          <w14:textOutline w14:w="12700" w14:cap="flat" w14:cmpd="sng" w14:algn="ctr">
-            <w14:noFill/>
-            <w14:prstDash w14:val="solid"/>
-            <w14:miter w14:lim="400000"/>
-          </w14:textOutline>
-        </w:rPr>
-        <w:t>June 2025</w:t>
-      </w:r>
-    </w:p>
-    <w:p>
-      <w:pPr>
-        <w:rPr>
-          <w:color w:val="000000"/>
-          <w:sz w:val="18"/>
-          <w:szCs w:val="18"/>
-          <w:u w:color="000000"/>
-          <w14:textOutline w14:w="12700" w14:cap="flat" w14:cmpd="sng" w14:algn="ctr">
-            <w14:noFill/>
-            <w14:prstDash w14:val="solid"/>
-            <w14:miter w14:lim="400000"/>
-          </w14:textOutline>
-        </w:rPr>
-      </w:pPr>
     </w:p>
     <w:p>
       <w:pPr>
@@ -490,97 +461,16 @@
           <w:sz w:val="18"/>
           <w:szCs w:val="18"/>
         </w:rPr>
-        <w:t>Traditional models of attention have emphasized either bottom-up salience detection (driven by stimulus features such as brightness, motion, or novelty) or top-down goal-directed control (driven by executive networks). While these accounts explain important aspects of selection, they often treat filtering as relatively static or modular and struggle to account for the highly adaptive, context-sensitive nature of perceptual prioritization observed across stable and volatile environments (</w:t>
-      </w:r>
-      <w:proofErr w:type="spellStart"/>
-      <w:r>
-        <w:rPr>
-          <w:color w:val="000000"/>
-          <w:sz w:val="18"/>
-          <w:szCs w:val="18"/>
-        </w:rPr>
-        <w:t>Menon</w:t>
-      </w:r>
-      <w:proofErr w:type="spellEnd"/>
-      <w:r>
-        <w:rPr>
-          <w:color w:val="000000"/>
-          <w:sz w:val="18"/>
-          <w:szCs w:val="18"/>
-        </w:rPr>
-        <w:t xml:space="preserve"> &amp; </w:t>
-      </w:r>
-      <w:proofErr w:type="spellStart"/>
-      <w:r>
-        <w:rPr>
-          <w:color w:val="000000"/>
-          <w:sz w:val="18"/>
-          <w:szCs w:val="18"/>
-        </w:rPr>
-        <w:t>Uddin</w:t>
-      </w:r>
-      <w:proofErr w:type="spellEnd"/>
-      <w:r>
-        <w:rPr>
-          <w:color w:val="000000"/>
-          <w:sz w:val="18"/>
-          <w:szCs w:val="18"/>
-        </w:rPr>
-        <w:t xml:space="preserve">, 2010; </w:t>
-      </w:r>
-      <w:proofErr w:type="spellStart"/>
-      <w:r>
-        <w:rPr>
-          <w:color w:val="000000"/>
-          <w:sz w:val="18"/>
-          <w:szCs w:val="18"/>
-        </w:rPr>
-        <w:t>Uddin</w:t>
-      </w:r>
-      <w:proofErr w:type="spellEnd"/>
-      <w:r>
-        <w:rPr>
-          <w:color w:val="000000"/>
-          <w:sz w:val="18"/>
-          <w:szCs w:val="18"/>
-        </w:rPr>
-        <w:t xml:space="preserve">, 2015; </w:t>
-      </w:r>
-      <w:proofErr w:type="spellStart"/>
-      <w:r>
-        <w:rPr>
-          <w:color w:val="000000"/>
-          <w:sz w:val="18"/>
-          <w:szCs w:val="18"/>
-        </w:rPr>
-        <w:t>Redinbaugh</w:t>
-      </w:r>
-      <w:proofErr w:type="spellEnd"/>
-      <w:r>
-        <w:rPr>
-          <w:color w:val="000000"/>
-          <w:sz w:val="18"/>
-          <w:szCs w:val="18"/>
-        </w:rPr>
-        <w:t xml:space="preserve"> &amp; </w:t>
-      </w:r>
-      <w:proofErr w:type="spellStart"/>
-      <w:r>
-        <w:rPr>
-          <w:color w:val="000000"/>
-          <w:sz w:val="18"/>
-          <w:szCs w:val="18"/>
-        </w:rPr>
-        <w:t>Saalmann</w:t>
-      </w:r>
-      <w:proofErr w:type="spellEnd"/>
-      <w:r>
-        <w:rPr>
-          <w:color w:val="000000"/>
-          <w:sz w:val="18"/>
-          <w:szCs w:val="18"/>
-        </w:rPr>
-        <w:t>, 2024). For example, the same neutral stimulus may capture attention in a high-volatility setting but be ignored in a predictable one; emotionally congruent information can “break through” even when low in physical salience; and prolonged exposure to consistent patterns leads to increasingly efficient, almost automatic selection.</w:t>
+        <w:t>Traditional models of attention have emphasized either bottom-up salience detection (driven by stimulus features such as brightness, motion, or novelty) or top-down goal-directed control (driven by executive networks). While these accounts explain important aspects of selection, they often treat filtering as relatively static or modular and struggle to account for the highly adaptive, context-sensitive nature of perceptual prioritization observed across stable and volatile environments (Menon &amp; Uddin, 2010; Uddin, 2015; Redinbaugh &amp; Saalmann, 2024). For example, the same neutral stimulus may capture attention in a high-</w:t>
+      </w:r>
+      <w:r>
+        <w:rPr>
+          <w:color w:val="000000"/>
+          <w:sz w:val="18"/>
+          <w:szCs w:val="18"/>
+        </w:rPr>
+        <w:lastRenderedPageBreak/>
+        <w:t>volatility setting but be ignored in a predictable one; emotionally congruent information can “break through” even when low in physical salience; and prolonged exposure to consistent patterns leads to increasingly efficient, almost automatic selection.</w:t>
       </w:r>
     </w:p>
     <w:p>
@@ -595,79 +485,7 @@
           <w:sz w:val="18"/>
           <w:szCs w:val="18"/>
         </w:rPr>
-        <w:t xml:space="preserve">Adaptive Resonance Filtering Theory (ARFT) addresses these limitations by proposing a single, integrated </w:t>
-      </w:r>
-      <w:proofErr w:type="spellStart"/>
-      <w:r>
-        <w:rPr>
-          <w:color w:val="000000"/>
-          <w:sz w:val="18"/>
-          <w:szCs w:val="18"/>
-        </w:rPr>
-        <w:t>neurocognitive</w:t>
-      </w:r>
-      <w:proofErr w:type="spellEnd"/>
-      <w:r>
-        <w:rPr>
-          <w:color w:val="000000"/>
-          <w:sz w:val="18"/>
-          <w:szCs w:val="18"/>
-        </w:rPr>
-        <w:t xml:space="preserve"> mechanism: selective perceptual filtering achieved through dynamic resonance and adaptive thresholds. Incoming sensory streams—visual, auditory, tactile, interoceptive—are continuously evaluated against a set of active internal cognitive-emotional schemas. These schemas are stable representational structures built from accumulated experience, emotional associations, contextual knowledge, and predictive expectations (</w:t>
-      </w:r>
-      <w:proofErr w:type="spellStart"/>
-      <w:r>
-        <w:rPr>
-          <w:color w:val="000000"/>
-          <w:sz w:val="18"/>
-          <w:szCs w:val="18"/>
-        </w:rPr>
-        <w:t>Friston</w:t>
-      </w:r>
-      <w:proofErr w:type="spellEnd"/>
-      <w:r>
-        <w:rPr>
-          <w:color w:val="000000"/>
-          <w:sz w:val="18"/>
-          <w:szCs w:val="18"/>
-        </w:rPr>
-        <w:t xml:space="preserve">, 2010; </w:t>
-      </w:r>
-      <w:proofErr w:type="spellStart"/>
-      <w:r>
-        <w:rPr>
-          <w:color w:val="000000"/>
-          <w:sz w:val="18"/>
-          <w:szCs w:val="18"/>
-        </w:rPr>
-        <w:t>Sprevak</w:t>
-      </w:r>
-      <w:proofErr w:type="spellEnd"/>
-      <w:r>
-        <w:rPr>
-          <w:color w:val="000000"/>
-          <w:sz w:val="18"/>
-          <w:szCs w:val="18"/>
-        </w:rPr>
-        <w:t xml:space="preserve"> &amp; Smith, 2023; </w:t>
-      </w:r>
-      <w:proofErr w:type="spellStart"/>
-      <w:r>
-        <w:rPr>
-          <w:color w:val="000000"/>
-          <w:sz w:val="18"/>
-          <w:szCs w:val="18"/>
-        </w:rPr>
-        <w:t>Peelen</w:t>
-      </w:r>
-      <w:proofErr w:type="spellEnd"/>
-      <w:r>
-        <w:rPr>
-          <w:color w:val="000000"/>
-          <w:sz w:val="18"/>
-          <w:szCs w:val="18"/>
-        </w:rPr>
-        <w:t xml:space="preserve"> et al., 2023). Resonance occurs when multidimensional alignment is detected across several key dimensions: perceptual structure (shape, rhythm, spatial configuration), temporal dynamics (timing and sequencing), memory-contextual fit (consistency with stored knowledge), affective valence (emotional tone and intensity), and intentional relevance (alignment with current goals or motivational states).</w:t>
+        <w:t>Adaptive Resonance Filtering Theory (ARFT) addresses these limitations by proposing a single, integrated neurocognitive mechanism: selective perceptual filtering achieved through dynamic resonance and adaptive thresholds. Incoming sensory streams—visual, auditory, tactile, interoceptive—are continuously evaluated against a set of active internal cognitive-emotional schemas. These schemas are stable representational structures built from accumulated experience, emotional associations, contextual knowledge, and predictive expectations (Friston, 2010; Sprevak &amp; Smith, 2023; Peelen et al., 2023). Resonance occurs when multidimensional alignment is detected across several key dimensions: perceptual structure (shape, rhythm, spatial configuration), temporal dynamics (timing and sequencing), memory-contextual fit (consistency with stored knowledge), affective valence (emotional tone and intensity), and intentional relevance (alignment with current goals or motivational states).</w:t>
       </w:r>
     </w:p>
     <w:p>
@@ -682,79 +500,7 @@
           <w:sz w:val="18"/>
           <w:szCs w:val="18"/>
         </w:rPr>
-        <w:t xml:space="preserve">When sufficient alignment is achieved, the resonant input is amplified: neural gain increases, oscillatory synchronization strengthens (especially gamma-theta coupling), perceptual features bind into a coherent gestalt, and the content gains conscious priority. When alignment fails, the input is attenuated—its processing resources are reduced, and it is effectively filtered from awareness. Critically, the thresholds that determine what counts as “sufficient” alignment are not fixed. They adapt dynamically according to recent prediction errors, estimated environmental volatility, current cognitive load, and affective state (Fries, 2005; </w:t>
-      </w:r>
-      <w:proofErr w:type="spellStart"/>
-      <w:r>
-        <w:rPr>
-          <w:color w:val="000000"/>
-          <w:sz w:val="18"/>
-          <w:szCs w:val="18"/>
-        </w:rPr>
-        <w:t>Cavanagh</w:t>
-      </w:r>
-      <w:proofErr w:type="spellEnd"/>
-      <w:r>
-        <w:rPr>
-          <w:color w:val="000000"/>
-          <w:sz w:val="18"/>
-          <w:szCs w:val="18"/>
-        </w:rPr>
-        <w:t xml:space="preserve"> &amp; Frank, 2014; </w:t>
-      </w:r>
-      <w:proofErr w:type="spellStart"/>
-      <w:r>
-        <w:rPr>
-          <w:color w:val="000000"/>
-          <w:sz w:val="18"/>
-          <w:szCs w:val="18"/>
-        </w:rPr>
-        <w:t>Ursino</w:t>
-      </w:r>
-      <w:proofErr w:type="spellEnd"/>
-      <w:r>
-        <w:rPr>
-          <w:color w:val="000000"/>
-          <w:sz w:val="18"/>
-          <w:szCs w:val="18"/>
-        </w:rPr>
-        <w:t xml:space="preserve"> &amp; </w:t>
-      </w:r>
-      <w:proofErr w:type="spellStart"/>
-      <w:r>
-        <w:rPr>
-          <w:color w:val="000000"/>
-          <w:sz w:val="18"/>
-          <w:szCs w:val="18"/>
-        </w:rPr>
-        <w:t>Pirazzini</w:t>
-      </w:r>
-      <w:proofErr w:type="spellEnd"/>
-      <w:r>
-        <w:rPr>
-          <w:color w:val="000000"/>
-          <w:sz w:val="18"/>
-          <w:szCs w:val="18"/>
-        </w:rPr>
-        <w:t xml:space="preserve">, 2024; </w:t>
-      </w:r>
-      <w:proofErr w:type="spellStart"/>
-      <w:r>
-        <w:rPr>
-          <w:color w:val="000000"/>
-          <w:sz w:val="18"/>
-          <w:szCs w:val="18"/>
-        </w:rPr>
-        <w:t>Piray</w:t>
-      </w:r>
-      <w:proofErr w:type="spellEnd"/>
-      <w:r>
-        <w:rPr>
-          <w:color w:val="000000"/>
-          <w:sz w:val="18"/>
-          <w:szCs w:val="18"/>
-        </w:rPr>
-        <w:t xml:space="preserve"> &amp; Daw, 2021). Frequent mismatches raise thresholds (increasing selectivity and narrowing the perceptual intake), while stable, predictable environments lower them (broadening sampling and facilitating fluid awareness).</w:t>
+        <w:t>When sufficient alignment is achieved, the resonant input is amplified: neural gain increases, oscillatory synchronization strengthens (especially gamma-theta coupling), perceptual features bind into a coherent gestalt, and the content gains conscious priority. When alignment fails, the input is attenuated—its processing resources are reduced, and it is effectively filtered from awareness. Critically, the thresholds that determine what counts as “sufficient” alignment are not fixed. They adapt dynamically according to recent prediction errors, estimated environmental volatility, current cognitive load, and affective state (Fries, 2005; Cavanagh &amp; Frank, 2014; Ursino &amp; Pirazzini, 2024; Piray &amp; Daw, 2021). Frequent mismatches raise thresholds (increasing selectivity and narrowing the perceptual intake), while stable, predictable environments lower them (broadening sampling and facilitating fluid awareness).</w:t>
       </w:r>
     </w:p>
     <w:p>
@@ -769,61 +515,7 @@
           <w:sz w:val="18"/>
           <w:szCs w:val="18"/>
         </w:rPr>
-        <w:t xml:space="preserve">This adaptive resonance process operates continuously at sub-second timescales, producing the seamless, selective flow of conscious experience we subjectively experience. ARFT integrates oscillatory synchronization, error monitoring, pathway reinforcement, predictive updating, and affective modulation into one coherent architecture. It explains not only moment-to-moment attentional selectivity but also longer-term patterns such as habituation to familiar stimuli, heightened sensitivity to threat in anxious individuals, emotional amplification of memory, and the development of perceptual expertise (Pessoa, 2017; </w:t>
-      </w:r>
-      <w:proofErr w:type="spellStart"/>
-      <w:r>
-        <w:rPr>
-          <w:color w:val="000000"/>
-          <w:sz w:val="18"/>
-          <w:szCs w:val="18"/>
-        </w:rPr>
-        <w:t>Valadez</w:t>
-      </w:r>
-      <w:proofErr w:type="spellEnd"/>
-      <w:r>
-        <w:rPr>
-          <w:color w:val="000000"/>
-          <w:sz w:val="18"/>
-          <w:szCs w:val="18"/>
-        </w:rPr>
-        <w:t xml:space="preserve"> et al., 2022; </w:t>
-      </w:r>
-      <w:proofErr w:type="spellStart"/>
-      <w:r>
-        <w:rPr>
-          <w:color w:val="000000"/>
-          <w:sz w:val="18"/>
-          <w:szCs w:val="18"/>
-        </w:rPr>
-        <w:t>Basanovic</w:t>
-      </w:r>
-      <w:proofErr w:type="spellEnd"/>
-      <w:r>
-        <w:rPr>
-          <w:color w:val="000000"/>
-          <w:sz w:val="18"/>
-          <w:szCs w:val="18"/>
-        </w:rPr>
-        <w:t xml:space="preserve">, 2024). The framework is designed to be mechanistically precise and empirically testable, offering clear predictions for </w:t>
-      </w:r>
-      <w:proofErr w:type="spellStart"/>
-      <w:r>
-        <w:rPr>
-          <w:color w:val="000000"/>
-          <w:sz w:val="18"/>
-          <w:szCs w:val="18"/>
-        </w:rPr>
-        <w:t>neuroimaging</w:t>
-      </w:r>
-      <w:proofErr w:type="spellEnd"/>
-      <w:r>
-        <w:rPr>
-          <w:color w:val="000000"/>
-          <w:sz w:val="18"/>
-          <w:szCs w:val="18"/>
-        </w:rPr>
-        <w:t>, electrophysiological, physiological, and behavioral measures. Ultimately, ARFT reframes perception as an active, self-organizing resonance process rather than a passive decoding or purely executive selection, providing a unified account of how the brain constructs prioritized, meaningful awareness from an overwhelmingly rich sensory world.</w:t>
+        <w:t>This adaptive resonance process operates continuously at sub-second timescales, producing the seamless, selective flow of conscious experience we subjectively experience. ARFT integrates oscillatory synchronization, error monitoring, pathway reinforcement, predictive updating, and affective modulation into one coherent architecture. It explains not only moment-to-moment attentional selectivity but also longer-term patterns such as habituation to familiar stimuli, heightened sensitivity to threat in anxious individuals, emotional amplification of memory, and the development of perceptual expertise (Pessoa, 2017; Valadez et al., 2022; Basanovic, 2024). The framework is designed to be mechanistically precise and empirically testable, offering clear predictions for neuroimaging, electrophysiological, physiological, and behavioral measures. Ultimately, ARFT reframes perception as an active, self-organizing resonance process rather than a passive decoding or purely executive selection, providing a unified account of how the brain constructs prioritized, meaningful awareness from an overwhelmingly rich sensory world.</w:t>
       </w:r>
     </w:p>
     <w:p>
@@ -963,97 +655,7 @@
           <w:sz w:val="18"/>
           <w:szCs w:val="18"/>
         </w:rPr>
-        <w:t xml:space="preserve">The RCM serves as the central matching engine of the system. It is primarily instantiated in networks involving the anterior </w:t>
-      </w:r>
-      <w:proofErr w:type="spellStart"/>
-      <w:r>
-        <w:rPr>
-          <w:color w:val="000000"/>
-          <w:sz w:val="18"/>
-          <w:szCs w:val="18"/>
-        </w:rPr>
-        <w:t>insula</w:t>
-      </w:r>
-      <w:proofErr w:type="spellEnd"/>
-      <w:r>
-        <w:rPr>
-          <w:color w:val="000000"/>
-          <w:sz w:val="18"/>
-          <w:szCs w:val="18"/>
-        </w:rPr>
-        <w:t>, anterior cingulate cortex, and broader salience network. Its function is to perform rapid, multidimensional comparison between incoming sensory input and currently active internal schemas (</w:t>
-      </w:r>
-      <w:proofErr w:type="spellStart"/>
-      <w:r>
-        <w:rPr>
-          <w:color w:val="000000"/>
-          <w:sz w:val="18"/>
-          <w:szCs w:val="18"/>
-        </w:rPr>
-        <w:t>Menon</w:t>
-      </w:r>
-      <w:proofErr w:type="spellEnd"/>
-      <w:r>
-        <w:rPr>
-          <w:color w:val="000000"/>
-          <w:sz w:val="18"/>
-          <w:szCs w:val="18"/>
-        </w:rPr>
-        <w:t xml:space="preserve"> &amp; </w:t>
-      </w:r>
-      <w:proofErr w:type="spellStart"/>
-      <w:r>
-        <w:rPr>
-          <w:color w:val="000000"/>
-          <w:sz w:val="18"/>
-          <w:szCs w:val="18"/>
-        </w:rPr>
-        <w:t>Uddin</w:t>
-      </w:r>
-      <w:proofErr w:type="spellEnd"/>
-      <w:r>
-        <w:rPr>
-          <w:color w:val="000000"/>
-          <w:sz w:val="18"/>
-          <w:szCs w:val="18"/>
-        </w:rPr>
-        <w:t xml:space="preserve">, 2010; </w:t>
-      </w:r>
-      <w:proofErr w:type="spellStart"/>
-      <w:r>
-        <w:rPr>
-          <w:color w:val="000000"/>
-          <w:sz w:val="18"/>
-          <w:szCs w:val="18"/>
-        </w:rPr>
-        <w:t>Uddin</w:t>
-      </w:r>
-      <w:proofErr w:type="spellEnd"/>
-      <w:r>
-        <w:rPr>
-          <w:color w:val="000000"/>
-          <w:sz w:val="18"/>
-          <w:szCs w:val="18"/>
-        </w:rPr>
-        <w:t xml:space="preserve">, 2015; </w:t>
-      </w:r>
-      <w:proofErr w:type="spellStart"/>
-      <w:r>
-        <w:rPr>
-          <w:color w:val="000000"/>
-          <w:sz w:val="18"/>
-          <w:szCs w:val="18"/>
-        </w:rPr>
-        <w:t>Schimmelpfennig</w:t>
-      </w:r>
-      <w:proofErr w:type="spellEnd"/>
-      <w:r>
-        <w:rPr>
-          <w:color w:val="000000"/>
-          <w:sz w:val="18"/>
-          <w:szCs w:val="18"/>
-        </w:rPr>
-        <w:t xml:space="preserve"> et al., 2023).</w:t>
+        <w:t>The RCM serves as the central matching engine of the system. It is primarily instantiated in networks involving the anterior insula, anterior cingulate cortex, and broader salience network. Its function is to perform rapid, multidimensional comparison between incoming sensory input and currently active internal schemas (Menon &amp; Uddin, 2010; Uddin, 2015; Schimmelpfennig et al., 2023).</w:t>
       </w:r>
     </w:p>
     <w:p>
@@ -2401,77 +2003,13 @@
           <w:bdr w:val="none" w:sz="0" w:space="0" w:color="auto"/>
         </w:rPr>
       </w:pPr>
-      <w:proofErr w:type="spellStart"/>
-      <w:r>
-        <w:rPr>
-          <w:color w:val="000000"/>
-          <w:sz w:val="18"/>
-          <w:szCs w:val="18"/>
-        </w:rPr>
-        <w:t>Neurodynamically</w:t>
-      </w:r>
-      <w:proofErr w:type="spellEnd"/>
-      <w:r>
-        <w:rPr>
-          <w:color w:val="000000"/>
-          <w:sz w:val="18"/>
-          <w:szCs w:val="18"/>
-        </w:rPr>
-        <w:t xml:space="preserve">, RCM operation is reflected in anterior cingulate theta oscillations (4–8 Hz) for conflict and mismatch detection and anterior </w:t>
-      </w:r>
-      <w:proofErr w:type="spellStart"/>
-      <w:r>
-        <w:rPr>
-          <w:color w:val="000000"/>
-          <w:sz w:val="18"/>
-          <w:szCs w:val="18"/>
-        </w:rPr>
-        <w:t>insula</w:t>
-      </w:r>
-      <w:proofErr w:type="spellEnd"/>
-      <w:r>
-        <w:rPr>
-          <w:color w:val="000000"/>
-          <w:sz w:val="18"/>
-          <w:szCs w:val="18"/>
-        </w:rPr>
-        <w:t xml:space="preserve"> gamma bursts for rapid salience tagging (</w:t>
-      </w:r>
-      <w:proofErr w:type="spellStart"/>
-      <w:r>
-        <w:rPr>
-          <w:color w:val="000000"/>
-          <w:sz w:val="18"/>
-          <w:szCs w:val="18"/>
-        </w:rPr>
-        <w:t>Cavanagh</w:t>
-      </w:r>
-      <w:proofErr w:type="spellEnd"/>
-      <w:r>
-        <w:rPr>
-          <w:color w:val="000000"/>
-          <w:sz w:val="18"/>
-          <w:szCs w:val="18"/>
-        </w:rPr>
-        <w:t xml:space="preserve"> &amp; Frank, 2014; </w:t>
-      </w:r>
-      <w:proofErr w:type="spellStart"/>
-      <w:r>
-        <w:rPr>
-          <w:color w:val="000000"/>
-          <w:sz w:val="18"/>
-          <w:szCs w:val="18"/>
-        </w:rPr>
-        <w:t>Uddin</w:t>
-      </w:r>
-      <w:proofErr w:type="spellEnd"/>
-      <w:r>
-        <w:rPr>
-          <w:color w:val="000000"/>
-          <w:sz w:val="18"/>
-          <w:szCs w:val="18"/>
-        </w:rPr>
-        <w:t>, 2015). This allows the system to perform multidimensional evaluation within approximately 80–150 milliseconds.</w:t>
+      <w:r>
+        <w:rPr>
+          <w:color w:val="000000"/>
+          <w:sz w:val="18"/>
+          <w:szCs w:val="18"/>
+        </w:rPr>
+        <w:t>Neurodynamically, RCM operation is reflected in anterior cingulate theta oscillations (4–8 Hz) for conflict and mismatch detection and anterior insula gamma bursts for rapid salience tagging (Cavanagh &amp; Frank, 2014; Uddin, 2015). This allows the system to perform multidimensional evaluation within approximately 80–150 milliseconds.</w:t>
       </w:r>
     </w:p>
     <w:p>
@@ -2519,133 +2057,7 @@
           <w:sz w:val="18"/>
           <w:szCs w:val="18"/>
         </w:rPr>
-        <w:t xml:space="preserve"> Resonance thresholds are inherently plastic and context-sensitive. The ATA mechanism, supported by </w:t>
-      </w:r>
-      <w:proofErr w:type="spellStart"/>
-      <w:r>
-        <w:rPr>
-          <w:color w:val="000000"/>
-          <w:sz w:val="18"/>
-          <w:szCs w:val="18"/>
-        </w:rPr>
-        <w:t>thalamo-cortical</w:t>
-      </w:r>
-      <w:proofErr w:type="spellEnd"/>
-      <w:r>
-        <w:rPr>
-          <w:color w:val="000000"/>
-          <w:sz w:val="18"/>
-          <w:szCs w:val="18"/>
-        </w:rPr>
-        <w:t xml:space="preserve"> loops, </w:t>
-      </w:r>
-      <w:proofErr w:type="spellStart"/>
-      <w:r>
-        <w:rPr>
-          <w:color w:val="000000"/>
-          <w:sz w:val="18"/>
-          <w:szCs w:val="18"/>
-        </w:rPr>
-        <w:t>orbitofrontal</w:t>
-      </w:r>
-      <w:proofErr w:type="spellEnd"/>
-      <w:r>
-        <w:rPr>
-          <w:color w:val="000000"/>
-          <w:sz w:val="18"/>
-          <w:szCs w:val="18"/>
-        </w:rPr>
-        <w:t xml:space="preserve"> cortex, and basal ganglia circuits, recalibrates the threshold in real time. The core update rule is: This formulation is consistent with broader computational work on adaptive learning under expected and unexpected uncertainty, volatility estimation, and predictive updating (</w:t>
-      </w:r>
-      <w:proofErr w:type="spellStart"/>
-      <w:r>
-        <w:rPr>
-          <w:color w:val="000000"/>
-          <w:sz w:val="18"/>
-          <w:szCs w:val="18"/>
-        </w:rPr>
-        <w:t>Soltani</w:t>
-      </w:r>
-      <w:proofErr w:type="spellEnd"/>
-      <w:r>
-        <w:rPr>
-          <w:color w:val="000000"/>
-          <w:sz w:val="18"/>
-          <w:szCs w:val="18"/>
-        </w:rPr>
-        <w:t xml:space="preserve"> &amp; </w:t>
-      </w:r>
-      <w:proofErr w:type="spellStart"/>
-      <w:r>
-        <w:rPr>
-          <w:color w:val="000000"/>
-          <w:sz w:val="18"/>
-          <w:szCs w:val="18"/>
-        </w:rPr>
-        <w:t>Izquierdo</w:t>
-      </w:r>
-      <w:proofErr w:type="spellEnd"/>
-      <w:r>
-        <w:rPr>
-          <w:color w:val="000000"/>
-          <w:sz w:val="18"/>
-          <w:szCs w:val="18"/>
-        </w:rPr>
-        <w:t xml:space="preserve">, 2019; </w:t>
-      </w:r>
-      <w:proofErr w:type="spellStart"/>
-      <w:r>
-        <w:rPr>
-          <w:color w:val="000000"/>
-          <w:sz w:val="18"/>
-          <w:szCs w:val="18"/>
-        </w:rPr>
-        <w:t>Piray</w:t>
-      </w:r>
-      <w:proofErr w:type="spellEnd"/>
-      <w:r>
-        <w:rPr>
-          <w:color w:val="000000"/>
-          <w:sz w:val="18"/>
-          <w:szCs w:val="18"/>
-        </w:rPr>
-        <w:t xml:space="preserve"> &amp; Daw, 2021; Walker et al., 2023; </w:t>
-      </w:r>
-      <w:proofErr w:type="spellStart"/>
-      <w:r>
-        <w:rPr>
-          <w:color w:val="000000"/>
-          <w:sz w:val="18"/>
-          <w:szCs w:val="18"/>
-        </w:rPr>
-        <w:t>Redinbaugh</w:t>
-      </w:r>
-      <w:proofErr w:type="spellEnd"/>
-      <w:r>
-        <w:rPr>
-          <w:color w:val="000000"/>
-          <w:sz w:val="18"/>
-          <w:szCs w:val="18"/>
-        </w:rPr>
-        <w:t xml:space="preserve"> &amp; </w:t>
-      </w:r>
-      <w:proofErr w:type="spellStart"/>
-      <w:r>
-        <w:rPr>
-          <w:color w:val="000000"/>
-          <w:sz w:val="18"/>
-          <w:szCs w:val="18"/>
-        </w:rPr>
-        <w:t>Saalmann</w:t>
-      </w:r>
-      <w:proofErr w:type="spellEnd"/>
-      <w:r>
-        <w:rPr>
-          <w:color w:val="000000"/>
-          <w:sz w:val="18"/>
-          <w:szCs w:val="18"/>
-        </w:rPr>
-        <w:t>, 2024).</w:t>
+        <w:t xml:space="preserve"> Resonance thresholds are inherently plastic and context-sensitive. The ATA mechanism, supported by thalamo-cortical loops, orbitofrontal cortex, and basal ganglia circuits, recalibrates the threshold in real time. The core update rule is: This formulation is consistent with broader computational work on adaptive learning under expected and unexpected uncertainty, volatility estimation, and predictive updating (Soltani &amp; Izquierdo, 2019; Piray &amp; Daw, 2021; Walker et al., 2023; Redinbaugh &amp; Saalmann, 2024).</w:t>
       </w:r>
     </w:p>
     <w:p>
@@ -3574,115 +2986,7 @@
           <w:sz w:val="18"/>
           <w:szCs w:val="18"/>
         </w:rPr>
-        <w:t xml:space="preserve">Once an input is tagged as resonant (), the RAP subsystem engages. These pathways primarily involve </w:t>
-      </w:r>
-      <w:proofErr w:type="spellStart"/>
-      <w:r>
-        <w:rPr>
-          <w:color w:val="000000"/>
-          <w:sz w:val="18"/>
-          <w:szCs w:val="18"/>
-        </w:rPr>
-        <w:t>frontoparietal</w:t>
-      </w:r>
-      <w:proofErr w:type="spellEnd"/>
-      <w:r>
-        <w:rPr>
-          <w:color w:val="000000"/>
-          <w:sz w:val="18"/>
-          <w:szCs w:val="18"/>
-        </w:rPr>
-        <w:t xml:space="preserve"> control networks, limbic-cortical routes, and </w:t>
-      </w:r>
-      <w:proofErr w:type="spellStart"/>
-      <w:r>
-        <w:rPr>
-          <w:color w:val="000000"/>
-          <w:sz w:val="18"/>
-          <w:szCs w:val="18"/>
-        </w:rPr>
-        <w:t>thalamocortical</w:t>
-      </w:r>
-      <w:proofErr w:type="spellEnd"/>
-      <w:r>
-        <w:rPr>
-          <w:color w:val="000000"/>
-          <w:sz w:val="18"/>
-          <w:szCs w:val="18"/>
-        </w:rPr>
-        <w:t xml:space="preserve"> relays. RAP performs three key functions: (1) signal gain enhancement through increased neural firing rates and oscillatory synchronization, (2) feature binding via cross-regional phase-locking (particularly gamma nested in theta rhythms), and (3) schema reinforcement through </w:t>
-      </w:r>
-      <w:proofErr w:type="spellStart"/>
-      <w:r>
-        <w:rPr>
-          <w:color w:val="000000"/>
-          <w:sz w:val="18"/>
-          <w:szCs w:val="18"/>
-        </w:rPr>
-        <w:t>Hebbian-like</w:t>
-      </w:r>
-      <w:proofErr w:type="spellEnd"/>
-      <w:r>
-        <w:rPr>
-          <w:color w:val="000000"/>
-          <w:sz w:val="18"/>
-          <w:szCs w:val="18"/>
-        </w:rPr>
-        <w:t xml:space="preserve"> weight updates (Fries, 2005; </w:t>
-      </w:r>
-      <w:proofErr w:type="spellStart"/>
-      <w:r>
-        <w:rPr>
-          <w:color w:val="000000"/>
-          <w:sz w:val="18"/>
-          <w:szCs w:val="18"/>
-        </w:rPr>
-        <w:t>Ellwood</w:t>
-      </w:r>
-      <w:proofErr w:type="spellEnd"/>
-      <w:r>
-        <w:rPr>
-          <w:color w:val="000000"/>
-          <w:sz w:val="18"/>
-          <w:szCs w:val="18"/>
-        </w:rPr>
-        <w:t xml:space="preserve">, 2024; </w:t>
-      </w:r>
-      <w:proofErr w:type="spellStart"/>
-      <w:r>
-        <w:rPr>
-          <w:color w:val="000000"/>
-          <w:sz w:val="18"/>
-          <w:szCs w:val="18"/>
-        </w:rPr>
-        <w:t>Ursino</w:t>
-      </w:r>
-      <w:proofErr w:type="spellEnd"/>
-      <w:r>
-        <w:rPr>
-          <w:color w:val="000000"/>
-          <w:sz w:val="18"/>
-          <w:szCs w:val="18"/>
-        </w:rPr>
-        <w:t xml:space="preserve"> &amp; </w:t>
-      </w:r>
-      <w:proofErr w:type="spellStart"/>
-      <w:r>
-        <w:rPr>
-          <w:color w:val="000000"/>
-          <w:sz w:val="18"/>
-          <w:szCs w:val="18"/>
-        </w:rPr>
-        <w:t>Pirazzini</w:t>
-      </w:r>
-      <w:proofErr w:type="spellEnd"/>
-      <w:r>
-        <w:rPr>
-          <w:color w:val="000000"/>
-          <w:sz w:val="18"/>
-          <w:szCs w:val="18"/>
-        </w:rPr>
-        <w:t>, 2024). The result is heightened perceptual clarity, sustained attention, and emotional amplification of the resonant content. Non-resonant inputs are actively suppressed via inhibitory projections.</w:t>
+        <w:t>Once an input is tagged as resonant (), the RAP subsystem engages. These pathways primarily involve frontoparietal control networks, limbic-cortical routes, and thalamocortical relays. RAP performs three key functions: (1) signal gain enhancement through increased neural firing rates and oscillatory synchronization, (2) feature binding via cross-regional phase-locking (particularly gamma nested in theta rhythms), and (3) schema reinforcement through Hebbian-like weight updates (Fries, 2005; Ellwood, 2024; Ursino &amp; Pirazzini, 2024). The result is heightened perceptual clarity, sustained attention, and emotional amplification of the resonant content. Non-resonant inputs are actively suppressed via inhibitory projections.</w:t>
       </w:r>
     </w:p>
     <w:p>
@@ -3805,6 +3109,7 @@
             <w14:miter w14:lim="400000"/>
           </w14:textOutline>
         </w:rPr>
+        <w:lastRenderedPageBreak/>
         <w:t>Phase 1:</w:t>
       </w:r>
       <w:r>
@@ -4331,79 +3636,7 @@
           <w:sz w:val="18"/>
           <w:szCs w:val="18"/>
         </w:rPr>
-        <w:t>Unpredictable contexts will elevate thresholds initially but trigger broader sampling, increasing sensitivity to peripheral events while producing transient rises in cognitive load markers (pupil dilation, frontal theta power) (</w:t>
-      </w:r>
-      <w:proofErr w:type="spellStart"/>
-      <w:r>
-        <w:rPr>
-          <w:color w:val="000000"/>
-          <w:sz w:val="18"/>
-          <w:szCs w:val="18"/>
-        </w:rPr>
-        <w:t>Alshanskaia</w:t>
-      </w:r>
-      <w:proofErr w:type="spellEnd"/>
-      <w:r>
-        <w:rPr>
-          <w:color w:val="000000"/>
-          <w:sz w:val="18"/>
-          <w:szCs w:val="18"/>
-        </w:rPr>
-        <w:t xml:space="preserve"> et al., 2024; </w:t>
-      </w:r>
-      <w:proofErr w:type="spellStart"/>
-      <w:r>
-        <w:rPr>
-          <w:color w:val="000000"/>
-          <w:sz w:val="18"/>
-          <w:szCs w:val="18"/>
-        </w:rPr>
-        <w:t>Soltani</w:t>
-      </w:r>
-      <w:proofErr w:type="spellEnd"/>
-      <w:r>
-        <w:rPr>
-          <w:color w:val="000000"/>
-          <w:sz w:val="18"/>
-          <w:szCs w:val="18"/>
-        </w:rPr>
-        <w:t xml:space="preserve"> &amp; </w:t>
-      </w:r>
-      <w:proofErr w:type="spellStart"/>
-      <w:r>
-        <w:rPr>
-          <w:color w:val="000000"/>
-          <w:sz w:val="18"/>
-          <w:szCs w:val="18"/>
-        </w:rPr>
-        <w:t>Izquierdo</w:t>
-      </w:r>
-      <w:proofErr w:type="spellEnd"/>
-      <w:r>
-        <w:rPr>
-          <w:color w:val="000000"/>
-          <w:sz w:val="18"/>
-          <w:szCs w:val="18"/>
-        </w:rPr>
-        <w:t xml:space="preserve">, 2019; </w:t>
-      </w:r>
-      <w:proofErr w:type="spellStart"/>
-      <w:r>
-        <w:rPr>
-          <w:color w:val="000000"/>
-          <w:sz w:val="18"/>
-          <w:szCs w:val="18"/>
-        </w:rPr>
-        <w:t>Piray</w:t>
-      </w:r>
-      <w:proofErr w:type="spellEnd"/>
-      <w:r>
-        <w:rPr>
-          <w:color w:val="000000"/>
-          <w:sz w:val="18"/>
-          <w:szCs w:val="18"/>
-        </w:rPr>
-        <w:t xml:space="preserve"> &amp; Daw, 2021).</w:t>
+        <w:t>Unpredictable contexts will elevate thresholds initially but trigger broader sampling, increasing sensitivity to peripheral events while producing transient rises in cognitive load markers (pupil dilation, frontal theta power) (Alshanskaia et al., 2024; Soltani &amp; Izquierdo, 2019; Piray &amp; Daw, 2021).</w:t>
       </w:r>
     </w:p>
     <w:p>
@@ -4447,25 +3680,7 @@
           <w:sz w:val="18"/>
           <w:szCs w:val="18"/>
         </w:rPr>
-        <w:t xml:space="preserve">Affectively congruent stimuli will achieve resonance more readily, leading to enhanced memory encoding and stronger gamma-band synchronization between sensory and limbic regions (Pessoa, 2017; </w:t>
-      </w:r>
-      <w:proofErr w:type="spellStart"/>
-      <w:r>
-        <w:rPr>
-          <w:color w:val="000000"/>
-          <w:sz w:val="18"/>
-          <w:szCs w:val="18"/>
-        </w:rPr>
-        <w:t>Valadez</w:t>
-      </w:r>
-      <w:proofErr w:type="spellEnd"/>
-      <w:r>
-        <w:rPr>
-          <w:color w:val="000000"/>
-          <w:sz w:val="18"/>
-          <w:szCs w:val="18"/>
-        </w:rPr>
-        <w:t xml:space="preserve"> et al., 2022).</w:t>
+        <w:t>Affectively congruent stimuli will achieve resonance more readily, leading to enhanced memory encoding and stronger gamma-band synchronization between sensory and limbic regions (Pessoa, 2017; Valadez et al., 2022).</w:t>
       </w:r>
     </w:p>
     <w:p>
@@ -4480,43 +3695,7 @@
           <w:sz w:val="18"/>
           <w:szCs w:val="18"/>
         </w:rPr>
-        <w:t xml:space="preserve">4.4 Individual Differences Prediction: High trait anxiety will show chronically elevated baseline thresholds and threat bias. ADHD will reflect unstable threshold dynamics due to impaired volatility estimation. Targeted resonance-training protocols (e.g., rhythmic </w:t>
-      </w:r>
-      <w:proofErr w:type="spellStart"/>
-      <w:r>
-        <w:rPr>
-          <w:color w:val="000000"/>
-          <w:sz w:val="18"/>
-          <w:szCs w:val="18"/>
-        </w:rPr>
-        <w:t>neurofeedback</w:t>
-      </w:r>
-      <w:proofErr w:type="spellEnd"/>
-      <w:r>
-        <w:rPr>
-          <w:color w:val="000000"/>
-          <w:sz w:val="18"/>
-          <w:szCs w:val="18"/>
-        </w:rPr>
-        <w:t>) are predicted to normalize thresholds and improve symptoms within 8–12 weeks (</w:t>
-      </w:r>
-      <w:proofErr w:type="spellStart"/>
-      <w:r>
-        <w:rPr>
-          <w:color w:val="000000"/>
-          <w:sz w:val="18"/>
-          <w:szCs w:val="18"/>
-        </w:rPr>
-        <w:t>Michelini</w:t>
-      </w:r>
-      <w:proofErr w:type="spellEnd"/>
-      <w:r>
-        <w:rPr>
-          <w:color w:val="000000"/>
-          <w:sz w:val="18"/>
-          <w:szCs w:val="18"/>
-        </w:rPr>
-        <w:t xml:space="preserve"> et al., 2022; Yuan et al., 2024; Su et al., 2025).</w:t>
+        <w:t>4.4 Individual Differences Prediction: High trait anxiety will show chronically elevated baseline thresholds and threat bias. ADHD will reflect unstable threshold dynamics due to impaired volatility estimation. Targeted resonance-training protocols (e.g., rhythmic neurofeedback) are predicted to normalize thresholds and improve symptoms within 8–12 weeks (Michelini et al., 2022; Yuan et al., 2024; Su et al., 2025).</w:t>
       </w:r>
     </w:p>
     <w:p>
@@ -4579,25 +3758,7 @@
           <w:sz w:val="18"/>
           <w:szCs w:val="18"/>
         </w:rPr>
-        <w:t>ARFT currently offers a functional and computational-level description. Precise circuit-level mappings require further high-resolution imaging. Individual, cultural, and neurodivergent variations in baseline oscillatory frequencies and affective gating need fuller parameterization (</w:t>
-      </w:r>
-      <w:proofErr w:type="spellStart"/>
-      <w:r>
-        <w:rPr>
-          <w:color w:val="000000"/>
-          <w:sz w:val="18"/>
-          <w:szCs w:val="18"/>
-        </w:rPr>
-        <w:t>Michelini</w:t>
-      </w:r>
-      <w:proofErr w:type="spellEnd"/>
-      <w:r>
-        <w:rPr>
-          <w:color w:val="000000"/>
-          <w:sz w:val="18"/>
-          <w:szCs w:val="18"/>
-        </w:rPr>
-        <w:t xml:space="preserve"> et al., 2022; Walker et al., 2023; Su et al., 2025).</w:t>
+        <w:t>ARFT currently offers a functional and computational-level description. Precise circuit-level mappings require further high-resolution imaging. Individual, cultural, and neurodivergent variations in baseline oscillatory frequencies and affective gating need fuller parameterization (Michelini et al., 2022; Walker et al., 2023; Su et al., 2025).</w:t>
       </w:r>
     </w:p>
     <w:p>
@@ -4836,95 +3997,13 @@
           <w:bdr w:val="none" w:sz="0" w:space="0" w:color="auto"/>
         </w:rPr>
       </w:pPr>
-      <w:proofErr w:type="spellStart"/>
-      <w:r>
-        <w:rPr>
-          <w:color w:val="000000"/>
-          <w:sz w:val="18"/>
-          <w:szCs w:val="18"/>
-        </w:rPr>
-        <w:t>Alshanskaia</w:t>
-      </w:r>
-      <w:proofErr w:type="spellEnd"/>
-      <w:r>
-        <w:rPr>
-          <w:color w:val="000000"/>
-          <w:sz w:val="18"/>
-          <w:szCs w:val="18"/>
-        </w:rPr>
-        <w:t xml:space="preserve">, E. I., </w:t>
-      </w:r>
-      <w:proofErr w:type="spellStart"/>
-      <w:r>
-        <w:rPr>
-          <w:color w:val="000000"/>
-          <w:sz w:val="18"/>
-          <w:szCs w:val="18"/>
-        </w:rPr>
-        <w:t>Portnova</w:t>
-      </w:r>
-      <w:proofErr w:type="spellEnd"/>
-      <w:r>
-        <w:rPr>
-          <w:color w:val="000000"/>
-          <w:sz w:val="18"/>
-          <w:szCs w:val="18"/>
-        </w:rPr>
-        <w:t xml:space="preserve">, G. V., </w:t>
-      </w:r>
-      <w:proofErr w:type="spellStart"/>
-      <w:r>
-        <w:rPr>
-          <w:color w:val="000000"/>
-          <w:sz w:val="18"/>
-          <w:szCs w:val="18"/>
-        </w:rPr>
-        <w:t>Liaukovich</w:t>
-      </w:r>
-      <w:proofErr w:type="spellEnd"/>
-      <w:r>
-        <w:rPr>
-          <w:color w:val="000000"/>
-          <w:sz w:val="18"/>
-          <w:szCs w:val="18"/>
-        </w:rPr>
-        <w:t xml:space="preserve">, K., &amp; </w:t>
-      </w:r>
-      <w:proofErr w:type="spellStart"/>
-      <w:r>
-        <w:rPr>
-          <w:color w:val="000000"/>
-          <w:sz w:val="18"/>
-          <w:szCs w:val="18"/>
-        </w:rPr>
-        <w:t>Martynova</w:t>
-      </w:r>
-      <w:proofErr w:type="spellEnd"/>
-      <w:r>
-        <w:rPr>
-          <w:color w:val="000000"/>
-          <w:sz w:val="18"/>
-          <w:szCs w:val="18"/>
-        </w:rPr>
-        <w:t xml:space="preserve">, O. V. (2024). </w:t>
-      </w:r>
-      <w:proofErr w:type="spellStart"/>
-      <w:r>
-        <w:rPr>
-          <w:color w:val="000000"/>
-          <w:sz w:val="18"/>
-          <w:szCs w:val="18"/>
-        </w:rPr>
-        <w:t>Pupillometry</w:t>
-      </w:r>
-      <w:proofErr w:type="spellEnd"/>
-      <w:r>
-        <w:rPr>
-          <w:color w:val="000000"/>
-          <w:sz w:val="18"/>
-          <w:szCs w:val="18"/>
-        </w:rPr>
-        <w:t xml:space="preserve"> and autonomic nervous system responses to cognitive load and false feedback: an unsupervised machine learning approach. </w:t>
+      <w:r>
+        <w:rPr>
+          <w:color w:val="000000"/>
+          <w:sz w:val="18"/>
+          <w:szCs w:val="18"/>
+        </w:rPr>
+        <w:t xml:space="preserve">Alshanskaia, E. I., Portnova, G. V., Liaukovich, K., &amp; Martynova, O. V. (2024). Pupillometry and autonomic nervous system responses to cognitive load and false feedback: an unsupervised machine learning approach. </w:t>
       </w:r>
       <w:r>
         <w:rPr>
@@ -4942,25 +4021,7 @@
           <w:sz w:val="18"/>
           <w:szCs w:val="18"/>
         </w:rPr>
-        <w:t xml:space="preserve">, 18, 1445697. </w:t>
-      </w:r>
-      <w:proofErr w:type="spellStart"/>
-      <w:r>
-        <w:rPr>
-          <w:color w:val="000000"/>
-          <w:sz w:val="18"/>
-          <w:szCs w:val="18"/>
-        </w:rPr>
-        <w:t>Basanovic</w:t>
-      </w:r>
-      <w:proofErr w:type="spellEnd"/>
-      <w:r>
-        <w:rPr>
-          <w:color w:val="000000"/>
-          <w:sz w:val="18"/>
-          <w:szCs w:val="18"/>
-        </w:rPr>
-        <w:t xml:space="preserve">, J. (2024). Attentional biases to signals of negative information: Reliable measurement across three anxiety domains. </w:t>
+        <w:t xml:space="preserve">, 18, 1445697. Basanovic, J. (2024). Attentional biases to signals of negative information: Reliable measurement across three anxiety domains. </w:t>
       </w:r>
       <w:r>
         <w:rPr>
@@ -4978,25 +4039,7 @@
           <w:sz w:val="18"/>
           <w:szCs w:val="18"/>
         </w:rPr>
-        <w:t xml:space="preserve">, 56(4), 4173–4187. </w:t>
-      </w:r>
-      <w:proofErr w:type="spellStart"/>
-      <w:r>
-        <w:rPr>
-          <w:color w:val="000000"/>
-          <w:sz w:val="18"/>
-          <w:szCs w:val="18"/>
-        </w:rPr>
-        <w:t>Buzsáki</w:t>
-      </w:r>
-      <w:proofErr w:type="spellEnd"/>
-      <w:r>
-        <w:rPr>
-          <w:color w:val="000000"/>
-          <w:sz w:val="18"/>
-          <w:szCs w:val="18"/>
-        </w:rPr>
-        <w:t xml:space="preserve">, G. (2006). </w:t>
+        <w:t xml:space="preserve">, 56(4), 4173–4187. Buzsáki, G. (2006). </w:t>
       </w:r>
       <w:r>
         <w:rPr>
@@ -5014,25 +4057,7 @@
           <w:sz w:val="18"/>
           <w:szCs w:val="18"/>
         </w:rPr>
-        <w:t xml:space="preserve">. Oxford University Press. </w:t>
-      </w:r>
-      <w:proofErr w:type="spellStart"/>
-      <w:r>
-        <w:rPr>
-          <w:color w:val="000000"/>
-          <w:sz w:val="18"/>
-          <w:szCs w:val="18"/>
-        </w:rPr>
-        <w:t>Cavanagh</w:t>
-      </w:r>
-      <w:proofErr w:type="spellEnd"/>
-      <w:r>
-        <w:rPr>
-          <w:color w:val="000000"/>
-          <w:sz w:val="18"/>
-          <w:szCs w:val="18"/>
-        </w:rPr>
-        <w:t xml:space="preserve">, J. F., &amp; Frank, M. J. (2014). Frontal theta as a mechanism for cognitive control. </w:t>
+        <w:t xml:space="preserve">. Oxford University Press. Cavanagh, J. F., &amp; Frank, M. J. (2014). Frontal theta as a mechanism for cognitive control. </w:t>
       </w:r>
       <w:r>
         <w:rPr>
@@ -5059,41 +4084,13 @@
           <w:bdr w:val="none" w:sz="0" w:space="0" w:color="auto"/>
         </w:rPr>
       </w:pPr>
-      <w:proofErr w:type="spellStart"/>
-      <w:r>
-        <w:rPr>
-          <w:color w:val="000000"/>
-          <w:sz w:val="18"/>
-          <w:szCs w:val="18"/>
-        </w:rPr>
-        <w:t>Ellwood</w:t>
-      </w:r>
-      <w:proofErr w:type="spellEnd"/>
-      <w:r>
-        <w:rPr>
-          <w:color w:val="000000"/>
-          <w:sz w:val="18"/>
-          <w:szCs w:val="18"/>
-        </w:rPr>
-        <w:t xml:space="preserve">, I. T. (2024). Short-term </w:t>
-      </w:r>
-      <w:proofErr w:type="spellStart"/>
-      <w:r>
-        <w:rPr>
-          <w:color w:val="000000"/>
-          <w:sz w:val="18"/>
-          <w:szCs w:val="18"/>
-        </w:rPr>
-        <w:t>Hebbian</w:t>
-      </w:r>
-      <w:proofErr w:type="spellEnd"/>
-      <w:r>
-        <w:rPr>
-          <w:color w:val="000000"/>
-          <w:sz w:val="18"/>
-          <w:szCs w:val="18"/>
-        </w:rPr>
-        <w:t xml:space="preserve"> learning can implement transformer-like attention. </w:t>
+      <w:r>
+        <w:rPr>
+          <w:color w:val="000000"/>
+          <w:sz w:val="18"/>
+          <w:szCs w:val="18"/>
+        </w:rPr>
+        <w:t xml:space="preserve">Ellwood, I. T. (2024). Short-term Hebbian learning can implement transformer-like attention. </w:t>
       </w:r>
       <w:r>
         <w:rPr>
@@ -5129,25 +4126,7 @@
           <w:sz w:val="18"/>
           <w:szCs w:val="18"/>
         </w:rPr>
-        <w:t xml:space="preserve">, 9(10), 474–480. </w:t>
-      </w:r>
-      <w:proofErr w:type="spellStart"/>
-      <w:r>
-        <w:rPr>
-          <w:color w:val="000000"/>
-          <w:sz w:val="18"/>
-          <w:szCs w:val="18"/>
-        </w:rPr>
-        <w:t>Friston</w:t>
-      </w:r>
-      <w:proofErr w:type="spellEnd"/>
-      <w:r>
-        <w:rPr>
-          <w:color w:val="000000"/>
-          <w:sz w:val="18"/>
-          <w:szCs w:val="18"/>
-        </w:rPr>
-        <w:t xml:space="preserve">, K. (2010). The free-energy principle: A unified brain theory? </w:t>
+        <w:t xml:space="preserve">, 9(10), 474–480. Friston, K. (2010). The free-energy principle: A unified brain theory? </w:t>
       </w:r>
       <w:r>
         <w:rPr>
@@ -5165,25 +4144,7 @@
           <w:sz w:val="18"/>
           <w:szCs w:val="18"/>
         </w:rPr>
-        <w:t xml:space="preserve">, 11(2), 127–138. </w:t>
-      </w:r>
-      <w:proofErr w:type="spellStart"/>
-      <w:r>
-        <w:rPr>
-          <w:color w:val="000000"/>
-          <w:sz w:val="18"/>
-          <w:szCs w:val="18"/>
-        </w:rPr>
-        <w:t>Klimesch</w:t>
-      </w:r>
-      <w:proofErr w:type="spellEnd"/>
-      <w:r>
-        <w:rPr>
-          <w:color w:val="000000"/>
-          <w:sz w:val="18"/>
-          <w:szCs w:val="18"/>
-        </w:rPr>
-        <w:t xml:space="preserve">, W. (2012). Alpha-band oscillations, attention, and controlled access to stored information. </w:t>
+        <w:t xml:space="preserve">, 11(2), 127–138. Klimesch, W. (2012). Alpha-band oscillations, attention, and controlled access to stored information. </w:t>
       </w:r>
       <w:r>
         <w:rPr>
@@ -5210,59 +4171,13 @@
           <w:bdr w:val="none" w:sz="0" w:space="0" w:color="auto"/>
         </w:rPr>
       </w:pPr>
-      <w:proofErr w:type="spellStart"/>
-      <w:r>
-        <w:rPr>
-          <w:color w:val="000000"/>
-          <w:sz w:val="18"/>
-          <w:szCs w:val="18"/>
-        </w:rPr>
-        <w:t>Menon</w:t>
-      </w:r>
-      <w:proofErr w:type="spellEnd"/>
-      <w:r>
-        <w:rPr>
-          <w:color w:val="000000"/>
-          <w:sz w:val="18"/>
-          <w:szCs w:val="18"/>
-        </w:rPr>
-        <w:t xml:space="preserve">, V., &amp; </w:t>
-      </w:r>
-      <w:proofErr w:type="spellStart"/>
-      <w:r>
-        <w:rPr>
-          <w:color w:val="000000"/>
-          <w:sz w:val="18"/>
-          <w:szCs w:val="18"/>
-        </w:rPr>
-        <w:t>Uddin</w:t>
-      </w:r>
-      <w:proofErr w:type="spellEnd"/>
-      <w:r>
-        <w:rPr>
-          <w:color w:val="000000"/>
-          <w:sz w:val="18"/>
-          <w:szCs w:val="18"/>
-        </w:rPr>
-        <w:t xml:space="preserve">, L. Q. (2010). Saliency, switching, attention and control: a network model of </w:t>
-      </w:r>
-      <w:proofErr w:type="spellStart"/>
-      <w:r>
-        <w:rPr>
-          <w:color w:val="000000"/>
-          <w:sz w:val="18"/>
-          <w:szCs w:val="18"/>
-        </w:rPr>
-        <w:t>insula</w:t>
-      </w:r>
-      <w:proofErr w:type="spellEnd"/>
-      <w:r>
-        <w:rPr>
-          <w:color w:val="000000"/>
-          <w:sz w:val="18"/>
-          <w:szCs w:val="18"/>
-        </w:rPr>
-        <w:t xml:space="preserve"> function. </w:t>
+      <w:r>
+        <w:rPr>
+          <w:color w:val="000000"/>
+          <w:sz w:val="18"/>
+          <w:szCs w:val="18"/>
+        </w:rPr>
+        <w:t xml:space="preserve">Menon, V., &amp; Uddin, L. Q. (2010). Saliency, switching, attention and control: a network model of insula function. </w:t>
       </w:r>
       <w:r>
         <w:rPr>
@@ -5280,61 +4195,7 @@
           <w:sz w:val="18"/>
           <w:szCs w:val="18"/>
         </w:rPr>
-        <w:t xml:space="preserve">, 214(5–6), 655–667. </w:t>
-      </w:r>
-      <w:proofErr w:type="spellStart"/>
-      <w:r>
-        <w:rPr>
-          <w:color w:val="000000"/>
-          <w:sz w:val="18"/>
-          <w:szCs w:val="18"/>
-        </w:rPr>
-        <w:t>Michelini</w:t>
-      </w:r>
-      <w:proofErr w:type="spellEnd"/>
-      <w:r>
-        <w:rPr>
-          <w:color w:val="000000"/>
-          <w:sz w:val="18"/>
-          <w:szCs w:val="18"/>
-        </w:rPr>
-        <w:t xml:space="preserve">, G., </w:t>
-      </w:r>
-      <w:proofErr w:type="spellStart"/>
-      <w:r>
-        <w:rPr>
-          <w:color w:val="000000"/>
-          <w:sz w:val="18"/>
-          <w:szCs w:val="18"/>
-        </w:rPr>
-        <w:t>Salmastyan</w:t>
-      </w:r>
-      <w:proofErr w:type="spellEnd"/>
-      <w:r>
-        <w:rPr>
-          <w:color w:val="000000"/>
-          <w:sz w:val="18"/>
-          <w:szCs w:val="18"/>
-        </w:rPr>
-        <w:t xml:space="preserve">, G., Vera, J. D., &amp; </w:t>
-      </w:r>
-      <w:proofErr w:type="spellStart"/>
-      <w:r>
-        <w:rPr>
-          <w:color w:val="000000"/>
-          <w:sz w:val="18"/>
-          <w:szCs w:val="18"/>
-        </w:rPr>
-        <w:t>Lenartowicz</w:t>
-      </w:r>
-      <w:proofErr w:type="spellEnd"/>
-      <w:r>
-        <w:rPr>
-          <w:color w:val="000000"/>
-          <w:sz w:val="18"/>
-          <w:szCs w:val="18"/>
-        </w:rPr>
-        <w:t xml:space="preserve">, A. (2022). Event-related brain oscillations in attention-deficit/hyperactivity disorder (ADHD): A systematic review and meta-analysis. </w:t>
+        <w:t xml:space="preserve">, 214(5–6), 655–667. Michelini, G., Salmastyan, G., Vera, J. D., &amp; Lenartowicz, A. (2022). Event-related brain oscillations in attention-deficit/hyperactivity disorder (ADHD): A systematic review and meta-analysis. </w:t>
       </w:r>
       <w:r>
         <w:rPr>
@@ -5352,25 +4213,7 @@
           <w:sz w:val="18"/>
           <w:szCs w:val="18"/>
         </w:rPr>
-        <w:t xml:space="preserve">, 174, 29–42. </w:t>
-      </w:r>
-      <w:proofErr w:type="spellStart"/>
-      <w:r>
-        <w:rPr>
-          <w:color w:val="000000"/>
-          <w:sz w:val="18"/>
-          <w:szCs w:val="18"/>
-        </w:rPr>
-        <w:t>Peelen</w:t>
-      </w:r>
-      <w:proofErr w:type="spellEnd"/>
-      <w:r>
-        <w:rPr>
-          <w:color w:val="000000"/>
-          <w:sz w:val="18"/>
-          <w:szCs w:val="18"/>
-        </w:rPr>
-        <w:t xml:space="preserve">, M. V., Clarke, A., &amp; Kravitz, D. J. (2023). Predictive processing of scenes and objects. </w:t>
+        <w:t xml:space="preserve">, 174, 29–42. Peelen, M. V., Clarke, A., &amp; Kravitz, D. J. (2023). Predictive processing of scenes and objects. </w:t>
       </w:r>
       <w:r>
         <w:rPr>
@@ -5415,23 +4258,14 @@
           <w:bdr w:val="none" w:sz="0" w:space="0" w:color="auto"/>
         </w:rPr>
       </w:pPr>
-      <w:proofErr w:type="spellStart"/>
-      <w:r>
-        <w:rPr>
-          <w:color w:val="000000"/>
-          <w:sz w:val="18"/>
-          <w:szCs w:val="18"/>
-        </w:rPr>
-        <w:t>Piray</w:t>
-      </w:r>
-      <w:proofErr w:type="spellEnd"/>
-      <w:r>
-        <w:rPr>
-          <w:color w:val="000000"/>
-          <w:sz w:val="18"/>
-          <w:szCs w:val="18"/>
-        </w:rPr>
-        <w:t xml:space="preserve">, P., &amp; Daw, N. D. (2021). A model for learning based on the joint estimation of stochasticity and volatility. </w:t>
+      <w:r>
+        <w:rPr>
+          <w:color w:val="000000"/>
+          <w:sz w:val="18"/>
+          <w:szCs w:val="18"/>
+        </w:rPr>
+        <w:lastRenderedPageBreak/>
+        <w:t xml:space="preserve">Piray, P., &amp; Daw, N. D. (2021). A model for learning based on the joint estimation of stochasticity and volatility. </w:t>
       </w:r>
       <w:r>
         <w:rPr>
@@ -5449,43 +4283,7 @@
           <w:sz w:val="18"/>
           <w:szCs w:val="18"/>
         </w:rPr>
-        <w:t xml:space="preserve">, 12, 6587. </w:t>
-      </w:r>
-      <w:proofErr w:type="spellStart"/>
-      <w:r>
-        <w:rPr>
-          <w:color w:val="000000"/>
-          <w:sz w:val="18"/>
-          <w:szCs w:val="18"/>
-        </w:rPr>
-        <w:t>Redinbaugh</w:t>
-      </w:r>
-      <w:proofErr w:type="spellEnd"/>
-      <w:r>
-        <w:rPr>
-          <w:color w:val="000000"/>
-          <w:sz w:val="18"/>
-          <w:szCs w:val="18"/>
-        </w:rPr>
-        <w:t xml:space="preserve">, M. J., &amp; </w:t>
-      </w:r>
-      <w:proofErr w:type="spellStart"/>
-      <w:r>
-        <w:rPr>
-          <w:color w:val="000000"/>
-          <w:sz w:val="18"/>
-          <w:szCs w:val="18"/>
-        </w:rPr>
-        <w:t>Saalmann</w:t>
-      </w:r>
-      <w:proofErr w:type="spellEnd"/>
-      <w:r>
-        <w:rPr>
-          <w:color w:val="000000"/>
-          <w:sz w:val="18"/>
-          <w:szCs w:val="18"/>
-        </w:rPr>
-        <w:t xml:space="preserve">, Y. B. (2024). Contributions of basal ganglia circuits to perception, attention, and consciousness. </w:t>
+        <w:t xml:space="preserve">, 12, 6587. Redinbaugh, M. J., &amp; Saalmann, Y. B. (2024). Contributions of basal ganglia circuits to perception, attention, and consciousness. </w:t>
       </w:r>
       <w:r>
         <w:rPr>
@@ -5503,79 +4301,7 @@
           <w:sz w:val="18"/>
           <w:szCs w:val="18"/>
         </w:rPr>
-        <w:t xml:space="preserve">, 36(8), 1620–1642. </w:t>
-      </w:r>
-      <w:proofErr w:type="spellStart"/>
-      <w:r>
-        <w:rPr>
-          <w:color w:val="000000"/>
-          <w:sz w:val="18"/>
-          <w:szCs w:val="18"/>
-        </w:rPr>
-        <w:t>Schimmelpfennig</w:t>
-      </w:r>
-      <w:proofErr w:type="spellEnd"/>
-      <w:r>
-        <w:rPr>
-          <w:color w:val="000000"/>
-          <w:sz w:val="18"/>
-          <w:szCs w:val="18"/>
-        </w:rPr>
-        <w:t xml:space="preserve">, J., </w:t>
-      </w:r>
-      <w:proofErr w:type="spellStart"/>
-      <w:r>
-        <w:rPr>
-          <w:color w:val="000000"/>
-          <w:sz w:val="18"/>
-          <w:szCs w:val="18"/>
-        </w:rPr>
-        <w:t>Topczewski</w:t>
-      </w:r>
-      <w:proofErr w:type="spellEnd"/>
-      <w:r>
-        <w:rPr>
-          <w:color w:val="000000"/>
-          <w:sz w:val="18"/>
-          <w:szCs w:val="18"/>
-        </w:rPr>
-        <w:t xml:space="preserve">, J., </w:t>
-      </w:r>
-      <w:proofErr w:type="spellStart"/>
-      <w:r>
-        <w:rPr>
-          <w:color w:val="000000"/>
-          <w:sz w:val="18"/>
-          <w:szCs w:val="18"/>
-        </w:rPr>
-        <w:t>Zajkowski</w:t>
-      </w:r>
-      <w:proofErr w:type="spellEnd"/>
-      <w:r>
-        <w:rPr>
-          <w:color w:val="000000"/>
-          <w:sz w:val="18"/>
-          <w:szCs w:val="18"/>
-        </w:rPr>
-        <w:t xml:space="preserve">, W., &amp; </w:t>
-      </w:r>
-      <w:proofErr w:type="spellStart"/>
-      <w:r>
-        <w:rPr>
-          <w:color w:val="000000"/>
-          <w:sz w:val="18"/>
-          <w:szCs w:val="18"/>
-        </w:rPr>
-        <w:t>Jankowiak-Siuda</w:t>
-      </w:r>
-      <w:proofErr w:type="spellEnd"/>
-      <w:r>
-        <w:rPr>
-          <w:color w:val="000000"/>
-          <w:sz w:val="18"/>
-          <w:szCs w:val="18"/>
-        </w:rPr>
-        <w:t xml:space="preserve">, K. (2023). The role of the salience network in cognitive and affective deficits. </w:t>
+        <w:t xml:space="preserve">, 36(8), 1620–1642. Schimmelpfennig, J., Topczewski, J., Zajkowski, W., &amp; Jankowiak-Siuda, K. (2023). The role of the salience network in cognitive and affective deficits. </w:t>
       </w:r>
       <w:r>
         <w:rPr>
@@ -5593,97 +4319,7 @@
           <w:sz w:val="18"/>
           <w:szCs w:val="18"/>
         </w:rPr>
-        <w:t xml:space="preserve">, 17, 1133367. </w:t>
-      </w:r>
-      <w:proofErr w:type="spellStart"/>
-      <w:r>
-        <w:rPr>
-          <w:color w:val="000000"/>
-          <w:sz w:val="18"/>
-          <w:szCs w:val="18"/>
-        </w:rPr>
-        <w:t>Seeley</w:t>
-      </w:r>
-      <w:proofErr w:type="spellEnd"/>
-      <w:r>
-        <w:rPr>
-          <w:color w:val="000000"/>
-          <w:sz w:val="18"/>
-          <w:szCs w:val="18"/>
-        </w:rPr>
-        <w:t xml:space="preserve">, W. W., </w:t>
-      </w:r>
-      <w:proofErr w:type="spellStart"/>
-      <w:r>
-        <w:rPr>
-          <w:color w:val="000000"/>
-          <w:sz w:val="18"/>
-          <w:szCs w:val="18"/>
-        </w:rPr>
-        <w:t>Menon</w:t>
-      </w:r>
-      <w:proofErr w:type="spellEnd"/>
-      <w:r>
-        <w:rPr>
-          <w:color w:val="000000"/>
-          <w:sz w:val="18"/>
-          <w:szCs w:val="18"/>
-        </w:rPr>
-        <w:t xml:space="preserve">, V., </w:t>
-      </w:r>
-      <w:proofErr w:type="spellStart"/>
-      <w:r>
-        <w:rPr>
-          <w:color w:val="000000"/>
-          <w:sz w:val="18"/>
-          <w:szCs w:val="18"/>
-        </w:rPr>
-        <w:t>Schatzberg</w:t>
-      </w:r>
-      <w:proofErr w:type="spellEnd"/>
-      <w:r>
-        <w:rPr>
-          <w:color w:val="000000"/>
-          <w:sz w:val="18"/>
-          <w:szCs w:val="18"/>
-        </w:rPr>
-        <w:t xml:space="preserve">, A. F., Keller, J., Glover, G. H., Kenna, H., </w:t>
-      </w:r>
-      <w:proofErr w:type="spellStart"/>
-      <w:r>
-        <w:rPr>
-          <w:color w:val="000000"/>
-          <w:sz w:val="18"/>
-          <w:szCs w:val="18"/>
-        </w:rPr>
-        <w:t>Reiss</w:t>
-      </w:r>
-      <w:proofErr w:type="spellEnd"/>
-      <w:r>
-        <w:rPr>
-          <w:color w:val="000000"/>
-          <w:sz w:val="18"/>
-          <w:szCs w:val="18"/>
-        </w:rPr>
-        <w:t xml:space="preserve">, A. L., &amp; </w:t>
-      </w:r>
-      <w:proofErr w:type="spellStart"/>
-      <w:r>
-        <w:rPr>
-          <w:color w:val="000000"/>
-          <w:sz w:val="18"/>
-          <w:szCs w:val="18"/>
-        </w:rPr>
-        <w:t>Greicius</w:t>
-      </w:r>
-      <w:proofErr w:type="spellEnd"/>
-      <w:r>
-        <w:rPr>
-          <w:color w:val="000000"/>
-          <w:sz w:val="18"/>
-          <w:szCs w:val="18"/>
-        </w:rPr>
-        <w:t xml:space="preserve">, M. D. (2007). Dissociable intrinsic connectivity networks for salience processing and executive control. </w:t>
+        <w:t xml:space="preserve">, 17, 1133367. Seeley, W. W., Menon, V., Schatzberg, A. F., Keller, J., Glover, G. H., Kenna, H., Reiss, A. L., &amp; Greicius, M. D. (2007). Dissociable intrinsic connectivity networks for salience processing and executive control. </w:t>
       </w:r>
       <w:r>
         <w:rPr>
@@ -5710,41 +4346,13 @@
           <w:bdr w:val="none" w:sz="0" w:space="0" w:color="auto"/>
         </w:rPr>
       </w:pPr>
-      <w:proofErr w:type="spellStart"/>
-      <w:r>
-        <w:rPr>
-          <w:color w:val="000000"/>
-          <w:sz w:val="18"/>
-          <w:szCs w:val="18"/>
-        </w:rPr>
-        <w:t>Soltani</w:t>
-      </w:r>
-      <w:proofErr w:type="spellEnd"/>
-      <w:r>
-        <w:rPr>
-          <w:color w:val="000000"/>
-          <w:sz w:val="18"/>
-          <w:szCs w:val="18"/>
-        </w:rPr>
-        <w:t xml:space="preserve">, A., &amp; </w:t>
-      </w:r>
-      <w:proofErr w:type="spellStart"/>
-      <w:r>
-        <w:rPr>
-          <w:color w:val="000000"/>
-          <w:sz w:val="18"/>
-          <w:szCs w:val="18"/>
-        </w:rPr>
-        <w:t>Izquierdo</w:t>
-      </w:r>
-      <w:proofErr w:type="spellEnd"/>
-      <w:r>
-        <w:rPr>
-          <w:color w:val="000000"/>
-          <w:sz w:val="18"/>
-          <w:szCs w:val="18"/>
-        </w:rPr>
-        <w:t xml:space="preserve">, A. (2019). Adaptive learning under expected and unexpected uncertainty. </w:t>
+      <w:r>
+        <w:rPr>
+          <w:color w:val="000000"/>
+          <w:sz w:val="18"/>
+          <w:szCs w:val="18"/>
+        </w:rPr>
+        <w:t xml:space="preserve">Soltani, A., &amp; Izquierdo, A. (2019). Adaptive learning under expected and unexpected uncertainty. </w:t>
       </w:r>
       <w:r>
         <w:rPr>
@@ -5762,25 +4370,7 @@
           <w:sz w:val="18"/>
           <w:szCs w:val="18"/>
         </w:rPr>
-        <w:t xml:space="preserve">, 20(10), 635–644. </w:t>
-      </w:r>
-      <w:proofErr w:type="spellStart"/>
-      <w:r>
-        <w:rPr>
-          <w:color w:val="000000"/>
-          <w:sz w:val="18"/>
-          <w:szCs w:val="18"/>
-        </w:rPr>
-        <w:t>Sprevak</w:t>
-      </w:r>
-      <w:proofErr w:type="spellEnd"/>
-      <w:r>
-        <w:rPr>
-          <w:color w:val="000000"/>
-          <w:sz w:val="18"/>
-          <w:szCs w:val="18"/>
-        </w:rPr>
-        <w:t xml:space="preserve">, M., &amp; Smith, R. (2023). An introduction to predictive processing models of perception and decision-making. </w:t>
+        <w:t xml:space="preserve">, 20(10), 635–644. Sprevak, M., &amp; Smith, R. (2023). An introduction to predictive processing models of perception and decision-making. </w:t>
       </w:r>
       <w:r>
         <w:rPr>
@@ -5798,25 +4388,7 @@
           <w:sz w:val="18"/>
           <w:szCs w:val="18"/>
         </w:rPr>
-        <w:t xml:space="preserve">. Su, Z., Wang, Y., Wang, B., Han, C., Zhang, H., Gu, Y., Chen, Y., Zhao, X., &amp; </w:t>
-      </w:r>
-      <w:proofErr w:type="spellStart"/>
-      <w:r>
-        <w:rPr>
-          <w:color w:val="000000"/>
-          <w:sz w:val="18"/>
-          <w:szCs w:val="18"/>
-        </w:rPr>
-        <w:t>Shi</w:t>
-      </w:r>
-      <w:proofErr w:type="spellEnd"/>
-      <w:r>
-        <w:rPr>
-          <w:color w:val="000000"/>
-          <w:sz w:val="18"/>
-          <w:szCs w:val="18"/>
-        </w:rPr>
-        <w:t xml:space="preserve">, Y. (2025). Executive function and neural oscillations in adults with attention-deficit/hyperactivity disorder: a systematic review. </w:t>
+        <w:t xml:space="preserve">. Su, Z., Wang, Y., Wang, B., Han, C., Zhang, H., Gu, Y., Chen, Y., Zhao, X., &amp; Shi, Y. (2025). Executive function and neural oscillations in adults with attention-deficit/hyperactivity disorder: a systematic review. </w:t>
       </w:r>
       <w:r>
         <w:rPr>
@@ -5834,25 +4406,7 @@
           <w:sz w:val="18"/>
           <w:szCs w:val="18"/>
         </w:rPr>
-        <w:t xml:space="preserve">, 19, 1617307. </w:t>
-      </w:r>
-      <w:proofErr w:type="spellStart"/>
-      <w:r>
-        <w:rPr>
-          <w:color w:val="000000"/>
-          <w:sz w:val="18"/>
-          <w:szCs w:val="18"/>
-        </w:rPr>
-        <w:t>Uddin</w:t>
-      </w:r>
-      <w:proofErr w:type="spellEnd"/>
-      <w:r>
-        <w:rPr>
-          <w:color w:val="000000"/>
-          <w:sz w:val="18"/>
-          <w:szCs w:val="18"/>
-        </w:rPr>
-        <w:t xml:space="preserve">, L. Q. (2015). Salience processing and insular cortical function and dysfunction. </w:t>
+        <w:t xml:space="preserve">, 19, 1617307. Uddin, L. Q. (2015). Salience processing and insular cortical function and dysfunction. </w:t>
       </w:r>
       <w:r>
         <w:rPr>
@@ -5870,43 +4424,7 @@
           <w:sz w:val="18"/>
           <w:szCs w:val="18"/>
         </w:rPr>
-        <w:t xml:space="preserve">, 16(1), 55–61. </w:t>
-      </w:r>
-      <w:proofErr w:type="spellStart"/>
-      <w:r>
-        <w:rPr>
-          <w:color w:val="000000"/>
-          <w:sz w:val="18"/>
-          <w:szCs w:val="18"/>
-        </w:rPr>
-        <w:t>Ursino</w:t>
-      </w:r>
-      <w:proofErr w:type="spellEnd"/>
-      <w:r>
-        <w:rPr>
-          <w:color w:val="000000"/>
-          <w:sz w:val="18"/>
-          <w:szCs w:val="18"/>
-        </w:rPr>
-        <w:t xml:space="preserve">, M., &amp; </w:t>
-      </w:r>
-      <w:proofErr w:type="spellStart"/>
-      <w:r>
-        <w:rPr>
-          <w:color w:val="000000"/>
-          <w:sz w:val="18"/>
-          <w:szCs w:val="18"/>
-        </w:rPr>
-        <w:t>Pirazzini</w:t>
-      </w:r>
-      <w:proofErr w:type="spellEnd"/>
-      <w:r>
-        <w:rPr>
-          <w:color w:val="000000"/>
-          <w:sz w:val="18"/>
-          <w:szCs w:val="18"/>
-        </w:rPr>
-        <w:t xml:space="preserve">, G. (2024). Theta–gamma coupling as a ubiquitous brain mechanism: implications for memory, attention, dreaming, imagination, and consciousness. </w:t>
+        <w:t xml:space="preserve">, 16(1), 55–61. Ursino, M., &amp; Pirazzini, G. (2024). Theta–gamma coupling as a ubiquitous brain mechanism: implications for memory, attention, dreaming, imagination, and consciousness. </w:t>
       </w:r>
       <w:r>
         <w:rPr>
@@ -5924,43 +4442,7 @@
           <w:sz w:val="18"/>
           <w:szCs w:val="18"/>
         </w:rPr>
-        <w:t xml:space="preserve">, 59, 101433. </w:t>
-      </w:r>
-      <w:proofErr w:type="spellStart"/>
-      <w:r>
-        <w:rPr>
-          <w:color w:val="000000"/>
-          <w:sz w:val="18"/>
-          <w:szCs w:val="18"/>
-        </w:rPr>
-        <w:t>Valadez</w:t>
-      </w:r>
-      <w:proofErr w:type="spellEnd"/>
-      <w:r>
-        <w:rPr>
-          <w:color w:val="000000"/>
-          <w:sz w:val="18"/>
-          <w:szCs w:val="18"/>
-        </w:rPr>
-        <w:t xml:space="preserve">, E. A., Pine, D. S., Fox, N. A., &amp; </w:t>
-      </w:r>
-      <w:proofErr w:type="spellStart"/>
-      <w:r>
-        <w:rPr>
-          <w:color w:val="000000"/>
-          <w:sz w:val="18"/>
-          <w:szCs w:val="18"/>
-        </w:rPr>
-        <w:t>Bar-Haim</w:t>
-      </w:r>
-      <w:proofErr w:type="spellEnd"/>
-      <w:r>
-        <w:rPr>
-          <w:color w:val="000000"/>
-          <w:sz w:val="18"/>
-          <w:szCs w:val="18"/>
-        </w:rPr>
-        <w:t xml:space="preserve">, Y. (2022). Attentional biases in human anxiety. </w:t>
+        <w:t xml:space="preserve">, 59, 101433. Valadez, E. A., Pine, D. S., Fox, N. A., &amp; Bar-Haim, Y. (2022). Attentional biases in human anxiety. </w:t>
       </w:r>
       <w:r>
         <w:rPr>
@@ -5970,9 +4452,16 @@
           <w:sz w:val="18"/>
           <w:szCs w:val="18"/>
         </w:rPr>
-        <w:t xml:space="preserve">Neuroscience &amp; </w:t>
-      </w:r>
-      <w:proofErr w:type="spellStart"/>
+        <w:t>Neuroscience &amp; Biobehavioral Reviews</w:t>
+      </w:r>
+      <w:r>
+        <w:rPr>
+          <w:color w:val="000000"/>
+          <w:sz w:val="18"/>
+          <w:szCs w:val="18"/>
+        </w:rPr>
+        <w:t xml:space="preserve">, 142, 104917. Walker, E. Y., Pohl, S., Denison, R. N., Barack, D. L., Lee, J., Block, N., Ma, W. J., &amp; Meyniel, F. (2023). Studying the neural representations of uncertainty. </w:t>
+      </w:r>
       <w:r>
         <w:rPr>
           <w:i/>
@@ -5981,9 +4470,16 @@
           <w:sz w:val="18"/>
           <w:szCs w:val="18"/>
         </w:rPr>
-        <w:t>Biobehavioral</w:t>
-      </w:r>
-      <w:proofErr w:type="spellEnd"/>
+        <w:t>Nature Neuroscience</w:t>
+      </w:r>
+      <w:r>
+        <w:rPr>
+          <w:color w:val="000000"/>
+          <w:sz w:val="18"/>
+          <w:szCs w:val="18"/>
+        </w:rPr>
+        <w:t xml:space="preserve">, 26, 1877–1888. Yuan, D., Yang, X., Wang, P., Yang, L., Yang, T., He, F., Xu, Y., &amp; Li, Z. (2024). Quantitative EEG and its relationship with attentional control in patients with anxiety disorders. </w:t>
+      </w:r>
       <w:r>
         <w:rPr>
           <w:i/>
@@ -5992,60 +4488,6 @@
           <w:sz w:val="18"/>
           <w:szCs w:val="18"/>
         </w:rPr>
-        <w:t xml:space="preserve"> Reviews</w:t>
-      </w:r>
-      <w:r>
-        <w:rPr>
-          <w:color w:val="000000"/>
-          <w:sz w:val="18"/>
-          <w:szCs w:val="18"/>
-        </w:rPr>
-        <w:t xml:space="preserve">, 142, 104917. Walker, E. Y., Pohl, S., Denison, R. N., Barack, D. L., Lee, J., Block, N., Ma, W. J., &amp; </w:t>
-      </w:r>
-      <w:proofErr w:type="spellStart"/>
-      <w:r>
-        <w:rPr>
-          <w:color w:val="000000"/>
-          <w:sz w:val="18"/>
-          <w:szCs w:val="18"/>
-        </w:rPr>
-        <w:t>Meyniel</w:t>
-      </w:r>
-      <w:proofErr w:type="spellEnd"/>
-      <w:r>
-        <w:rPr>
-          <w:color w:val="000000"/>
-          <w:sz w:val="18"/>
-          <w:szCs w:val="18"/>
-        </w:rPr>
-        <w:t xml:space="preserve">, F. (2023). Studying the neural representations of uncertainty. </w:t>
-      </w:r>
-      <w:r>
-        <w:rPr>
-          <w:i/>
-          <w:iCs/>
-          <w:color w:val="000000"/>
-          <w:sz w:val="18"/>
-          <w:szCs w:val="18"/>
-        </w:rPr>
-        <w:t>Nature Neuroscience</w:t>
-      </w:r>
-      <w:r>
-        <w:rPr>
-          <w:color w:val="000000"/>
-          <w:sz w:val="18"/>
-          <w:szCs w:val="18"/>
-        </w:rPr>
-        <w:t xml:space="preserve">, 26, 1877–1888. Yuan, D., Yang, X., Wang, P., Yang, L., Yang, T., He, F., Xu, Y., &amp; Li, Z. (2024). Quantitative EEG and its relationship with attentional control in patients with anxiety disorders. </w:t>
-      </w:r>
-      <w:r>
-        <w:rPr>
-          <w:i/>
-          <w:iCs/>
-          <w:color w:val="000000"/>
-          <w:sz w:val="18"/>
-          <w:szCs w:val="18"/>
-        </w:rPr>
         <w:t>Frontiers in Psychiatry</w:t>
       </w:r>
       <w:r>
@@ -6071,35 +4513,19 @@
           </w14:textOutline>
         </w:rPr>
       </w:pPr>
-      <w:proofErr w:type="spellStart"/>
-      <w:r>
-        <w:rPr>
-          <w:color w:val="000000"/>
-          <w:sz w:val="18"/>
-          <w:szCs w:val="18"/>
-          <w:u w:color="000000"/>
-          <w14:textOutline w14:w="12700" w14:cap="flat" w14:cmpd="sng" w14:algn="ctr">
-            <w14:noFill/>
-            <w14:prstDash w14:val="solid"/>
-            <w14:miter w14:lim="400000"/>
-          </w14:textOutline>
-        </w:rPr>
-        <w:t>Seeley</w:t>
-      </w:r>
-      <w:proofErr w:type="spellEnd"/>
-      <w:r>
-        <w:rPr>
-          <w:color w:val="000000"/>
-          <w:sz w:val="18"/>
-          <w:szCs w:val="18"/>
-          <w:u w:color="000000"/>
-          <w14:textOutline w14:w="12700" w14:cap="flat" w14:cmpd="sng" w14:algn="ctr">
-            <w14:noFill/>
-            <w14:prstDash w14:val="solid"/>
-            <w14:miter w14:lim="400000"/>
-          </w14:textOutline>
-        </w:rPr>
-        <w:t xml:space="preserve">, W. W., et al. (2007). Dissociable intrinsic connectivity networks for salience processing and executive control. </w:t>
+      <w:r>
+        <w:rPr>
+          <w:color w:val="000000"/>
+          <w:sz w:val="18"/>
+          <w:szCs w:val="18"/>
+          <w:u w:color="000000"/>
+          <w14:textOutline w14:w="12700" w14:cap="flat" w14:cmpd="sng" w14:algn="ctr">
+            <w14:noFill/>
+            <w14:prstDash w14:val="solid"/>
+            <w14:miter w14:lim="400000"/>
+          </w14:textOutline>
+        </w:rPr>
+        <w:t xml:space="preserve">Seeley, W. W., et al. (2007). Dissociable intrinsic connectivity networks for salience processing and executive control. </w:t>
       </w:r>
       <w:r>
         <w:rPr>
@@ -10028,10 +8454,26 @@
 </file>
 
 <file path=customXml/item1.xml><?xml version="1.0" encoding="utf-8"?>
-<b:Sources xmlns:b="http://schemas.openxmlformats.org/officeDocument/2006/bibliography" xmlns="http://schemas.openxmlformats.org/officeDocument/2006/bibliography" SelectedStyle="\APASixthEditionOfficeOnline.xsl" StyleName="APA" Version="6"/>
+<p:properties xmlns:p="http://schemas.microsoft.com/office/2006/metadata/properties" xmlns:xsi="http://www.w3.org/2001/XMLSchema-instance" xmlns:pc="http://schemas.microsoft.com/office/infopath/2007/PartnerControls">
+  <documentManagement>
+    <TaxCatchAll xmlns="ce5264cd-2933-4f1d-9ccf-564f0c8f34c0" xsi:nil="true"/>
+    <lcf76f155ced4ddcb4097134ff3c332f xmlns="40915466-697b-4597-97a8-8ce3ba18083c">
+      <Terms xmlns="http://schemas.microsoft.com/office/infopath/2007/PartnerControls"/>
+    </lcf76f155ced4ddcb4097134ff3c332f>
+  </documentManagement>
+</p:properties>
 </file>
 
 <file path=customXml/item2.xml><?xml version="1.0" encoding="utf-8"?>
+<?mso-contentType ?>
+<FormTemplates xmlns="http://schemas.microsoft.com/sharepoint/v3/contenttype/forms">
+  <Display>DocumentLibraryForm</Display>
+  <Edit>DocumentLibraryForm</Edit>
+  <New>DocumentLibraryForm</New>
+</FormTemplates>
+</file>
+
+<file path=customXml/item3.xml><?xml version="1.0" encoding="utf-8"?>
 <ct:contentTypeSchema xmlns:ct="http://schemas.microsoft.com/office/2006/metadata/contentType" xmlns:ma="http://schemas.microsoft.com/office/2006/metadata/properties/metaAttributes" ct:_="" ma:_="" ma:contentTypeName="Document" ma:contentTypeID="0x010100CA19EDAD6CC8A44BADBF5390A7549DBA" ma:contentTypeVersion="11" ma:contentTypeDescription="Create a new document." ma:contentTypeScope="" ma:versionID="ab6f55c28e73582c465e71dd7b1e612b">
   <xsd:schema xmlns:xsd="http://www.w3.org/2001/XMLSchema" xmlns:xs="http://www.w3.org/2001/XMLSchema" xmlns:p="http://schemas.microsoft.com/office/2006/metadata/properties" xmlns:ns2="40915466-697b-4597-97a8-8ce3ba18083c" xmlns:ns3="ce5264cd-2933-4f1d-9ccf-564f0c8f34c0" targetNamespace="http://schemas.microsoft.com/office/2006/metadata/properties" ma:root="true" ma:fieldsID="9843b965ebdc657e2ca15c09c806933b" ns2:_="" ns3:_="">
     <xsd:import namespace="40915466-697b-4597-97a8-8ce3ba18083c"/>
@@ -10226,43 +8668,52 @@
 </ct:contentTypeSchema>
 </file>
 
-<file path=customXml/item3.xml><?xml version="1.0" encoding="utf-8"?>
-<?mso-contentType ?>
-<FormTemplates xmlns="http://schemas.microsoft.com/sharepoint/v3/contenttype/forms">
-  <Display>DocumentLibraryForm</Display>
-  <Edit>DocumentLibraryForm</Edit>
-  <New>DocumentLibraryForm</New>
-</FormTemplates>
-</file>
-
 <file path=customXml/item4.xml><?xml version="1.0" encoding="utf-8"?>
-<p:properties xmlns:p="http://schemas.microsoft.com/office/2006/metadata/properties" xmlns:xsi="http://www.w3.org/2001/XMLSchema-instance" xmlns:pc="http://schemas.microsoft.com/office/infopath/2007/PartnerControls">
-  <documentManagement>
-    <TaxCatchAll xmlns="ce5264cd-2933-4f1d-9ccf-564f0c8f34c0" xsi:nil="true"/>
-    <lcf76f155ced4ddcb4097134ff3c332f xmlns="40915466-697b-4597-97a8-8ce3ba18083c">
-      <Terms xmlns="http://schemas.microsoft.com/office/infopath/2007/PartnerControls"/>
-    </lcf76f155ced4ddcb4097134ff3c332f>
-  </documentManagement>
-</p:properties>
+<b:Sources xmlns:b="http://schemas.openxmlformats.org/officeDocument/2006/bibliography" xmlns="http://schemas.openxmlformats.org/officeDocument/2006/bibliography" SelectedStyle="\APASixthEditionOfficeOnline.xsl" StyleName="APA" Version="6"/>
 </file>
 
 <file path=customXml/itemProps1.xml><?xml version="1.0" encoding="utf-8"?>
-<ds:datastoreItem xmlns:ds="http://schemas.openxmlformats.org/officeDocument/2006/customXml" ds:itemID="{B2FC29DC-B95A-462C-8586-634E8550E9BE}">
+<ds:datastoreItem xmlns:ds="http://schemas.openxmlformats.org/officeDocument/2006/customXml" ds:itemID="{37361B9B-07BF-49D2-827E-1446A659C7C1}">
   <ds:schemaRefs>
-    <ds:schemaRef ds:uri="http://schemas.openxmlformats.org/officeDocument/2006/bibliography"/>
-    <ds:schemaRef ds:uri="http://www.w3.org/2000/xmlns/"/>
+    <ds:schemaRef ds:uri="http://schemas.microsoft.com/office/2006/metadata/properties"/>
+    <ds:schemaRef ds:uri="http://schemas.microsoft.com/office/infopath/2007/PartnerControls"/>
+    <ds:schemaRef ds:uri="ce5264cd-2933-4f1d-9ccf-564f0c8f34c0"/>
+    <ds:schemaRef ds:uri="40915466-697b-4597-97a8-8ce3ba18083c"/>
   </ds:schemaRefs>
 </ds:datastoreItem>
 </file>
 
 <file path=customXml/itemProps2.xml><?xml version="1.0" encoding="utf-8"?>
-<ds:datastoreItem xmlns:ds="http://schemas.openxmlformats.org/officeDocument/2006/customXml" ds:itemID="{50D88D02-BDEA-4504-8ABB-E271634B62AB}"/>
+<ds:datastoreItem xmlns:ds="http://schemas.openxmlformats.org/officeDocument/2006/customXml" ds:itemID="{33C7719B-8034-4CD6-A9EA-D3BF527A1F86}">
+  <ds:schemaRefs>
+    <ds:schemaRef ds:uri="http://schemas.microsoft.com/sharepoint/v3/contenttype/forms"/>
+  </ds:schemaRefs>
+</ds:datastoreItem>
 </file>
 
 <file path=customXml/itemProps3.xml><?xml version="1.0" encoding="utf-8"?>
-<ds:datastoreItem xmlns:ds="http://schemas.openxmlformats.org/officeDocument/2006/customXml" ds:itemID="{33C7719B-8034-4CD6-A9EA-D3BF527A1F86}"/>
+<ds:datastoreItem xmlns:ds="http://schemas.openxmlformats.org/officeDocument/2006/customXml" ds:itemID="{50D88D02-BDEA-4504-8ABB-E271634B62AB}">
+  <ds:schemaRefs>
+    <ds:schemaRef ds:uri="http://schemas.microsoft.com/office/2006/metadata/contentType"/>
+    <ds:schemaRef ds:uri="http://schemas.microsoft.com/office/2006/metadata/properties/metaAttributes"/>
+    <ds:schemaRef ds:uri="http://www.w3.org/2001/XMLSchema"/>
+    <ds:schemaRef ds:uri="http://schemas.microsoft.com/office/2006/metadata/properties"/>
+    <ds:schemaRef ds:uri="40915466-697b-4597-97a8-8ce3ba18083c"/>
+    <ds:schemaRef ds:uri="ce5264cd-2933-4f1d-9ccf-564f0c8f34c0"/>
+    <ds:schemaRef ds:uri="http://schemas.microsoft.com/office/2006/documentManagement/types"/>
+    <ds:schemaRef ds:uri="http://schemas.microsoft.com/office/infopath/2007/PartnerControls"/>
+    <ds:schemaRef ds:uri="http://schemas.openxmlformats.org/package/2006/metadata/core-properties"/>
+    <ds:schemaRef ds:uri="http://purl.org/dc/elements/1.1/"/>
+    <ds:schemaRef ds:uri="http://purl.org/dc/terms/"/>
+    <ds:schemaRef ds:uri="http://schemas.microsoft.com/internal/obd"/>
+  </ds:schemaRefs>
+</ds:datastoreItem>
 </file>
 
 <file path=customXml/itemProps4.xml><?xml version="1.0" encoding="utf-8"?>
-<ds:datastoreItem xmlns:ds="http://schemas.openxmlformats.org/officeDocument/2006/customXml" ds:itemID="{37361B9B-07BF-49D2-827E-1446A659C7C1}"/>
+<ds:datastoreItem xmlns:ds="http://schemas.openxmlformats.org/officeDocument/2006/customXml" ds:itemID="{B2FC29DC-B95A-462C-8586-634E8550E9BE}">
+  <ds:schemaRefs>
+    <ds:schemaRef ds:uri="http://schemas.openxmlformats.org/officeDocument/2006/bibliography"/>
+  </ds:schemaRefs>
+</ds:datastoreItem>
 </file>
</xml_diff>